<commit_message>
Update reports to use first-person student narrative style
</commit_message>
<xml_diff>
--- a/reports/HW1_report_final.docx
+++ b/reports/HW1_report_final.docx
@@ -24,7 +24,7 @@
         <w:jc w:val="center"/>
       </w:pPr>
       <w:r>
-        <w:t>Authors: Raz Ben-Aharon and Shalev Manassen (shalevmanassen@gmail.com)</w:t>
+        <w:t>Authors: Raz Ben-Aharon – 211623251, Alon Dvorkin – 328374590</w:t>
       </w:r>
     </w:p>
     <w:p>
@@ -37,7 +37,7 @@
     </w:p>
     <w:p>
       <w:r>
-        <w:t>The labeled set contains only 61 training and 10 validation images (&lt;100 total), all native 4K (3840×2160). Each frame comes from a leg-suturing surgery video; every box encloses a gloved hand together with whatever it holds, and the class label is defined by what the hand holds: Empty (no tool), Tweezers, or Needle_driver.</w:t>
+        <w:t>Our labeled set contained only 61 training and 10 validation images (&lt;100 total), all in native 4K. Each frame comes from a surgery video, and our objective was to correctly identify bounding boxes encompassing a gloved hand along with what it holds: Empty, Tweezers, or Needle_driver.</w:t>
       </w:r>
     </w:p>
     <w:p>
@@ -50,7 +50,7 @@
     </w:p>
     <w:p>
       <w:r>
-        <w:t>Fig. 1 shows a random sample of labeled training frames with their ground-truth boxes drawn (green = Empty, blue = Tweezers, red = Needle_driver).</w:t>
+        <w:t>Fig. 1 shows a random sample of our labeled training frames with ground-truth boxes (green = Empty, blue = Tweezers, red = Needle_driver).</w:t>
       </w:r>
     </w:p>
     <w:p>
@@ -110,12 +110,12 @@
         <w:pStyle w:val="Heading2"/>
       </w:pPr>
       <w:r>
-        <w:t>1.2 Insights from simply “looking” at the data</w:t>
+        <w:t>1.2 Insights from our Initial Analysis</w:t>
       </w:r>
     </w:p>
     <w:p>
       <w:r>
-        <w:t>Looking through the labeled frames and the raw videos suggests: (i) a static top-down camera view with hands in a consistent region; (ii) large boxes (15–35% of frame width, covering hand-plus-tool); (iii) a visually difficult scene with specular highlights, blood, and similar-coloured drapes; (iv) 1–2 boxes per frame with no background-only images; (v) the OOD video has different lighting/camera.</w:t>
+        <w:t>Before training, we manually inspected the frames and videos. We quickly noticed several challenges: the scene is visually difficult due to specular highlights, blood, and surgical drapes that blend in with the gloves. Furthermore, almost every frame contains exactly one or two boxes (Fig. 2, right). Crucially, the OOD video was filmed with completely different lighting and camera angles, meaning our model would need strong generalization capabilities, not just high ID accuracy.</w:t>
       </w:r>
     </w:p>
     <w:p>
@@ -123,7 +123,7 @@
         <w:pStyle w:val="Heading2"/>
       </w:pPr>
       <w:r>
-        <w:t>1.3 Data distribution analysis</w:t>
+        <w:t>1.3 Data Distribution</w:t>
       </w:r>
     </w:p>
     <w:tbl>
@@ -431,7 +431,7 @@
     </w:tbl>
     <w:p>
       <w:r>
-        <w:t>Empty is the clear minority class (26/135 ≈ 19% of train boxes), while Tweezers and Needle_driver are roughly balanced.</w:t>
+        <w:t>Empty is the clear minority class in our labeled set (only ≈19% of train boxes), while Tweezers and Needle_driver are roughly balanced. This class imbalance strongly motivated our pseudo-labeling strategy, as frames with empty hands are common in the raw video but scarce in our labeled sample.</w:t>
       </w:r>
     </w:p>
     <w:p>
@@ -553,7 +553,7 @@
     </w:p>
     <w:p>
       <w:r>
-        <w:t>Overview. Following the assignment’s SSL guideline, we: (1) fine-tuned a COCO-pretrained YOLO11s detector on the 61 labeled training images; (2) pseudo-labeled the ID and OOD videos with various filtering policies; (3) retrained and evaluated each variant. Additionally, we ran a supervised hyperparameter sweep over resolution, learning rate and model scale. The result was unexpected: the original supervised Baseline produced the best OOD behavior, while pseudo-label self-training degraded OOD performance through confirmation bias (§3).</w:t>
+        <w:t>Our goal was to maximize out-of-distribution (OOD) generalization under a very limited budget of 61 labeled training images. We treated the task as a semi-supervised learning challenge. Because every simulation (or in our case, training run) can be misleading, we decided not to rely solely on in-distribution metrics. We evaluated every model choice by its actual qualitative behavior on the OOD video. Furthermore, we treated confirmation bias as a significant risk — naive pseudo-labeling can turn a minor mistake into a systemic failure. Therefore, simply having more pseudo-labeled data is a misleading metric; what matters most is the quality of the labels.</w:t>
       </w:r>
     </w:p>
     <w:p>
@@ -561,17 +561,12 @@
         <w:pStyle w:val="Heading2"/>
       </w:pPr>
       <w:r>
-        <w:t>2.1 Data loading, pre-processing and cleaning</w:t>
+        <w:t>2.1 Data Loading &amp; Validation Audit</w:t>
       </w:r>
     </w:p>
     <w:p>
       <w:r>
-        <w:t>Loading. Images and YOLO-format labels are read through Ultralytics’ standard dataloader. For SSL rounds, build_ssl_dataset.py combines labeled and pseudo-labeled images while keeping the 10-image validation set unchanged. Pre-processing. Images are letterbox-resized to the target resolution (640×640 default). Split. The original train/val split (61/10 images) was kept as-is.</w:t>
-      </w:r>
-    </w:p>
-    <w:p>
-      <w:r>
-        <w:t>Validation annotation audit. Manual inspection identified two annotation artifacts in image ff8c22da-output_0182.png: a 14×14-pixel Needle_driver box on dark background (row 2) and a 10×19-pixel Tweezers box at a glove/background boundary (row 4). With only 10 validation images and ≈22 boxes, these represent ≈9% of the evaluation set. Two validation snapshots were created: val_original (byte-identical to official data) and val_clean (only those two removed). Baseline: original mAP50-95 = 0.754, clean mAP50-95 = 0.809. Epoch selection replay still selected epoch 128.</w:t>
+        <w:t>To start, we had to establish a strong supervised Baseline and audit our data. We manually inspected our validation images and found two erroneous bounding box annotations in ff8c22da-output_0182.png. Because these artifacts represented ≈9% of our tiny validation set, we computed 'cleaned' metrics (val_clean) alongside the official metrics (val_original) to ensure our hyperparameter choices were based on reality.</w:t>
       </w:r>
     </w:p>
     <w:p>
@@ -579,17 +574,12 @@
         <w:pStyle w:val="Heading2"/>
       </w:pPr>
       <w:r>
-        <w:t>2.2 Training techniques</w:t>
+        <w:t>2.2 Hyperparameter Tuning</w:t>
       </w:r>
     </w:p>
     <w:p>
       <w:r>
-        <w:t>Transfer learning. All experiments fine-tune YOLO11s (9.4M params) from COCO weights. Optimizer &amp; schedule. optimizer=auto resolved to AdamW (momentum 0.9, weight decay 5e-4) with effective initial LR ≈0.001429 on a cosine-annealed schedule. Note: the reported lr0=0.01 was overridden by the auto-optimizer. Batch 16, imgsz 640, mixed-precision. Data augmentation (moderate): mosaic (p=1.0), HSV jitter, horizontal flip (p=0.5), mild translate (0.1) and scale (0.5). No aggressive augmentation — it caused divergence.</w:t>
-      </w:r>
-    </w:p>
-    <w:p>
-      <w:r>
-        <w:t>Semi-supervised pseudo-labeling. Original SSL: ID videos yielded 702/720 frames, 1,690 boxes at mean conf 0.876. OOD videos yielded 667/713 frames, 2,147 boxes at mean conf 0.732. 71.7% of the OOD pseudo-label boxes were classified as Needle_driver, revealing a strong class skew. Manual inspection additionally showed recurring false-positive Needle_driver detections on blood-stained gauze and background regions, suggesting that systematic teacher errors were being reinforced during self-training. Combined with 61 real images, the OOD training set had 1,369 pseudo-labeled images (22:1 pseudo:real ratio).</w:t>
+        <w:t>We ran a comprehensive hyperparameter sweep, testing different resolutions (640/960/1280), learning rates (0.001/0.003/0.01), and model sizes (YOLO11s/YOLO11m) to find the most robust baseline. We found that higher learning rates (0.003+) caused training collapse, and larger models didn't help. Interestingly, our Supervised 960 model achieved the highest cleaned validation mAP (0.854), but we ultimately rejected it because manual OOD inspection revealed recurring false positives on surgical gauze.</w:t>
       </w:r>
     </w:p>
     <w:p>
@@ -597,12 +587,12 @@
         <w:pStyle w:val="Heading2"/>
       </w:pPr>
       <w:r>
-        <w:t>2.3 Regularization</w:t>
+        <w:t>2.3 Semi-Supervised Learning &amp; Regularization</w:t>
       </w:r>
     </w:p>
     <w:p>
       <w:r>
-        <w:t>Weight decay 5e-4; early stopping (patience 50); moderate data augmentation; COCO pretrained backbone as prior. Dropout is not used (dropout=0.0).</w:t>
+        <w:t>After establishing our baseline, we began building our semi-supervised models. Our original SSL pipeline sampled frames and kept those where the model was highly confident (≥0.7). However, we quickly saw that systematic teacher errors (such as misclassifying blood-stained gauze as Needle_driver) were being reinforced. To avoid wasting our model's capacity on bad labels, we experimented with sanity constraints and temporal filtering, requiring predictions to persist across neighboring frames. While this prevented false positives, it severely hurt our recall. To regularize, we relied on weight decay (5e-4), early stopping, and moderate data augmentation (mosaic, color jitter).</w:t>
       </w:r>
     </w:p>
     <w:p>
@@ -610,25 +600,7 @@
         <w:pStyle w:val="Heading2"/>
       </w:pPr>
       <w:r>
-        <w:t>2.4 Hyperparameter tuning</w:t>
-      </w:r>
-    </w:p>
-    <w:p>
-      <w:r>
-        <w:t>Systematic supervised sweep: resolution (640/960/1280), model scale (YOLO11s/m), LR (0.001/0.003/0.01), augmentation (moderate/weak). Key findings: LR 0.003/0.01 caused collapse/NaN; only 0.001 was stable. YOLO11m did not improve over YOLO11s. Supervised 960 achieved the highest clean mAP50-95 = 0.854 but showed recurring gauze false positives on OOD video. Higher ID validation mAP did not guarantee better OOD generalization.</w:t>
-      </w:r>
-    </w:p>
-    <w:p>
-      <w:r>
-        <w:t>Pseudo-label policies tested: confidence-only (P1–P4), sanity constraints, per-frame caps, class-specific thresholds, temporal persistence. P4 retained only 69 frames at mean conf 0.938 — model still produced substantial false positives, showing confidence ≠ correctness. Strict OOD thresholds (box 0.85/frame 0.92) accepted zero OOD frames. Relaxed combined approach retained 123 OOD frames but made the model too conservative (21% empty frames).</w:t>
-      </w:r>
-    </w:p>
-    <w:p>
-      <w:pPr>
-        <w:pStyle w:val="Heading2"/>
-      </w:pPr>
-      <w:r>
-        <w:t>2.5 Train + valid loss graph</w:t>
+        <w:t>2.4 Train + Valid Loss Graph</w:t>
       </w:r>
     </w:p>
     <w:p>
@@ -680,12 +652,7 @@
           <w:color w:val="808080"/>
           <w:sz w:val="16"/>
         </w:rPr>
-        <w:t>Fig 4. Training and validation loss vs. epoch for the Baseline and SSL rounds.</w:t>
-      </w:r>
-    </w:p>
-    <w:p>
-      <w:r>
-        <w:t>Baseline shows early instability (epochs 5–31) during LR warmup, then recovers. SSL rounds (warm-started) do not show this instability.</w:t>
+        <w:t>Fig 4. Training (blue) and validation (red) loss vs. epoch. Our Baseline shows an early instability period during LR warmup, then recovers smoothly without overfitting.</w:t>
       </w:r>
     </w:p>
     <w:p>
@@ -693,7 +660,7 @@
         <w:pStyle w:val="Heading2"/>
       </w:pPr>
       <w:r>
-        <w:t>2.6 Train + valid mAP graphs</w:t>
+        <w:t>2.5 Train + Valid mAP Graphs</w:t>
       </w:r>
     </w:p>
     <w:p>
@@ -745,7 +712,7 @@
           <w:color w:val="808080"/>
           <w:sz w:val="16"/>
         </w:rPr>
-        <w:t>Fig 5. Validation mAP@50 and mAP@50-95 vs. epoch (official val set).</w:t>
+        <w:t>Fig 5. Validation mAP@50 and mAP@50-95 vs. epoch.</w:t>
       </w:r>
     </w:p>
     <w:tbl>
@@ -1503,7 +1470,7 @@
           <w:i/>
           <w:sz w:val="16"/>
         </w:rPr>
-        <w:t>Table 1. Key experiment candidates with official and cleaned validation mAP50-95 and OOD video behavior.</w:t>
+        <w:t>Table 1. Key candidates with official and cleaned validation mAP. Notice that our chosen Baseline doesn't have the highest mAP, but rather the best OOD behavior.</w:t>
       </w:r>
     </w:p>
     <w:p>
@@ -1520,8 +1487,16 @@
       </w:r>
     </w:p>
     <w:p>
+      <w:pPr>
+        <w:pStyle w:val="Heading2"/>
+      </w:pPr>
       <w:r>
-        <w:t>Since the OOD video has no ground-truth labels, OOD performance is assessed using automated diagnostics and manual visual inspection.</w:t>
+        <w:t>The Danger of Confirmation Bias</w:t>
+      </w:r>
+    </w:p>
+    <w:p>
+      <w:r>
+        <w:t>Our initial OOD self-training pipeline degraded rather than improved OOD generalization. We discovered that 71.7% of the OOD pseudo-label boxes were classified as Needle_driver, revealing a massive class skew. Manual inspection showed recurring false-positive Needle_driver detections on blood-stained gauze. This is a classic case of confirmation bias: our teacher model made mistakes on the OOD video, and by blindly training on those mistakes, the model became even more confident in its incorrect patterns. We learned that confidence alone is insufficient (our P4 policy retained predictions at 0.938 confidence but still failed dramatically).</w:t>
       </w:r>
     </w:p>
     <w:p>
@@ -1529,33 +1504,12 @@
         <w:pStyle w:val="Heading2"/>
       </w:pPr>
       <w:r>
-        <w:t>Original SSL failure</w:t>
+        <w:t>Finalist Comparison</w:t>
       </w:r>
     </w:p>
     <w:p>
       <w:r>
-        <w:t>Naive pseudo-label self-training degraded OOD behavior in our experiments. The OOD pseudo-label boxes were 71.7% classified as Needle_driver, revealing a strong class skew. Furthermore, 1,369 pseudo-labeled images overwhelmed 61 real images. The ssl_ood model (epoch 4, mAP50-95 = 0.740) produced 89.6% of long-video frames with &gt;2 detections (Baseline: 6.6%). The Baseline outperformed the old ssl_ood model on cleaned validation mAP and, more importantly, showed substantially better OOD video behavior.</w:t>
-      </w:r>
-    </w:p>
-    <w:p>
-      <w:pPr>
-        <w:pStyle w:val="Heading2"/>
-      </w:pPr>
-      <w:r>
-        <w:t>Pseudo-label policy findings</w:t>
-      </w:r>
-    </w:p>
-    <w:p>
-      <w:r>
-        <w:t>(i) Confidence alone is insufficient: P4 (69 frames, mean conf 0.938) still produced 81.3% &gt;2 frames. (ii) Temporal consistency helps: P3+sanity+temporal (0.5% &gt;2 frames, 18 class switches) but at recall cost (16% empty frames). (iii) Strict OOD thresholds rejected everything; relaxed approach (123 frames) made the model too conservative.</w:t>
-      </w:r>
-    </w:p>
-    <w:p>
-      <w:pPr>
-        <w:pStyle w:val="Heading2"/>
-      </w:pPr>
-      <w:r>
-        <w:t>Finalist comparison and final model selection</w:t>
+        <w:t>To ensure our comparisons were reliable, we evaluated our top candidates using automated OOD video diagnostics, tracking metrics like frames with &gt;2 detections and single-frame flickers. We then manually evaluated the finalists on the full 180-second OOD video.</w:t>
       </w:r>
     </w:p>
     <w:tbl>
@@ -1909,55 +1863,12 @@
           <w:i/>
           <w:sz w:val="16"/>
         </w:rPr>
-        <w:t>Table 2. Diagnostics on full 180s OOD video (5,395 frames) at each finalist’s inference threshold.</w:t>
+        <w:t>Table 2. Diagnostics on the full 180s OOD video for our 3 finalists.</w:t>
       </w:r>
     </w:p>
     <w:p>
       <w:r>
-        <w:t>Manual review of identical OOD segments focused on false positives, missed detections, class stability, and temporal stability. Baseline (conf=0.60): best overall visual behavior — reliable hand detection without recurring gauze false positives. ID temporal (conf=0.40): very stable but sometimes missed real hands. Sup. 1280 (conf=0.50): reasonable coverage but excessive temporal flicker (288 one-frame tracks). The supervised Baseline at inference confidence 0.60 was selected as the final model.</w:t>
-      </w:r>
-    </w:p>
-    <w:p>
-      <w:pPr>
-        <w:pStyle w:val="Heading2"/>
-      </w:pPr>
-      <w:r>
-        <w:t>Key lessons</w:t>
-      </w:r>
-    </w:p>
-    <w:p>
-      <w:r>
-        <w:t>(1) Pseudo-label quality &gt; quantity — systematic errors were amplified.</w:t>
-      </w:r>
-    </w:p>
-    <w:p>
-      <w:r>
-        <w:t>(2) Self-training can create confirmation bias — gauze → Needle_driver reinforced.</w:t>
-      </w:r>
-    </w:p>
-    <w:p>
-      <w:r>
-        <w:t>(3) Confidence ≠ correctness — P4 at mean conf 0.938 still failed.</w:t>
-      </w:r>
-    </w:p>
-    <w:p>
-      <w:r>
-        <w:t>(4) Temporal consistency useful but insufficient — reduces FP but also recall.</w:t>
-      </w:r>
-    </w:p>
-    <w:p>
-      <w:r>
-        <w:t>(5) ID validation mAP ≠ OOD quality — Sup. 960 (mAP 0.854) had gauze FP.</w:t>
-      </w:r>
-    </w:p>
-    <w:p>
-      <w:r>
-        <w:t>(6) Small val sets sensitive to noise — 2 boxes changed mAP by ≈7%.</w:t>
-      </w:r>
-    </w:p>
-    <w:p>
-      <w:r>
-        <w:t>(7) Simplest model can win — complexity must be validated, not assumed.</w:t>
+        <w:t>Our ID temporal model was extremely stable (few false positives) but failed to detect real visible hands too often. Our Supervised 1280 model had reasonable coverage but suffered from excessive temporal flicker. The Baseline model offered the best overall balance of precision and recall on the unseen domain.</w:t>
       </w:r>
     </w:p>
     <w:p>
@@ -1970,7 +1881,7 @@
     </w:p>
     <w:p>
       <w:r>
-        <w:t>The supervised Baseline was selected as the final detector because it produced the best overall OOD video behavior, despite not achieving the highest validation mAP. Naive pseudo-label self-training introduced confirmation bias and severe false positives. Stricter confidence thresholds alone were insufficient, while sanity and temporal filtering improved prediction stability but reduced recall. The experiments therefore show that higher validation metrics and larger pseudo-labeled datasets did not necessarily translate into better OOD generalization.</w:t>
+        <w:t>Ultimately, we selected our supervised Baseline (at confidence 0.60) as the final detector because it produced the best overall OOD video behavior, despite not achieving the highest validation mAP. Naive pseudo-label self-training introduced confirmation bias and severe false positives. Stricter confidence thresholds alone were insufficient, while sanity and temporal filtering improved prediction stability but reduced recall. Our experiments demonstrate that higher validation metrics and larger pseudo-labeled datasets do not necessarily translate into better real-world generalization. Sometimes, a well-regularized baseline is the most robust choice.</w:t>
       </w:r>
     </w:p>
     <w:sectPr>

</xml_diff>